<commit_message>
docs(papers): add citations for 16 previously-uncited references
Add inline citations to body so every reference list entry is cited:
- §3.2 FSTS: Aiken & West (1991), O'Brien (2007)
- §3.2 Controls: Hambrick & Mason (1984)
- §3.3 Methods: MacKinnon & White (1985), Haans et al. (2016),
  Aguinis et al. (2005), Cohen (1988), Antonakis et al. (2010),
  Meyer et al. (2017), Shaver (2020)
- §1.1: Barney (1991), Peng (2003), Peng et al. (2008)
- §1.2: Banalieva & Dhanaraj (2019), Stallkamp & Schotter (2021)
- §7 Limitations: Wolfolds & Siegel (2019), Lakens et al. (2018)

All 33 reference entries now have at least one in-text citation.

https://claude.ai/code/session_01Kfe4f9RT1xiN1xvffjyyoW
</commit_message>
<xml_diff>
--- a/papers/p3-singapore/Manuscript_Blinded_MIR_2_revised.docx
+++ b/papers/p3-singapore/Manuscript_Blinded_MIR_2_revised.docx
@@ -185,7 +185,7 @@
           <w:szCs w:val="20"/>
           <w:rtl w:val="0"/>
         </w:rPr>
-        <w:t>Singapore is an analytically valuable setting for revisiting the internationalization–performance relationship because it combines high digital maturity with firm-level heterogeneity in export intensity. The classic I–P literature explains nonlinearity through a trade-off between the scale and learning benefits of international expansion and the rising coordination costs of operating across markets, with the inverted-U emerging as the modal empirical pattern in the broader literature (Marano et al., 2016). However, much of this literature was developed in pre-digital or transitional-digital settings and may not fully capture how the I–P curve behaves when firms operate in a digitally mature institutional environment.</w:t>
+        <w:t>Singapore is an analytically valuable setting for revisiting the internationalization–performance relationship because it combines high digital maturity with firm-level heterogeneity in export intensity. The classic I–P literature explains nonlinearity through a trade-off between the scale and learning benefits of international expansion and the rising coordination costs of operating across markets, with the inverted-U emerging as the modal empirical pattern in the broader literature (Marano et al., 2016). However, much of this literature was developed in pre-digital or transitional-digital settings, where institutional and infrastructural conditions differ substantially from those of digital-frontier environments (Peng, 2003; Peng et al., 2008) and may not fully capture how the I–P curve behaves when firms operate in a digitally mature institutional environment.</w:t>
       </w:r>
       <w:r>
         <w:rPr>
@@ -229,7 +229,7 @@
           <w:szCs w:val="20"/>
           <w:rtl w:val="0"/>
         </w:rPr>
-        <w:t>A second motivation concerns construct clarity. In digitally mature settings, firms may differ not only in deeper technological capability rooted in learning, innovation, and absorptive capacity, but also in the extent to which they adopt basic digital interfaces and transaction-enabling systems. These two domains should not be collapsed into a single umbrella construct, because technological capability reflects firm-internal capability depth (Cohen &amp; Levinthal, 1990; Lall, 1992), whereas digital adoption reflects participation in digitally enabled transactions and interfaces that may be more contingent on the surrounding digital ecosystem (Bharadwaj et al., 2013; Verhoef et al., 2021).</w:t>
+        <w:t>A second motivation concerns construct clarity. In digitally mature settings, firms may differ not only in deeper technological capability rooted in learning, innovation, and absorptive capacity, but also in the extent to which they adopt basic digital interfaces and transaction-enabling systems. These two domains should not be collapsed into a single umbrella construct, because technological capability reflects firm-internal capability depth grounded in resource-based and absorptive-capacity logic (Barney, 1991; Cohen &amp; Levinthal, 1990; Lall, 1992), whereas digital adoption reflects participation in digitally enabled transactions and interfaces that may be more contingent on the surrounding digital ecosystem (Bharadwaj et al., 2013; Verhoef et al., 2021).</w:t>
       </w:r>
       <w:r>
         <w:rPr>
@@ -296,7 +296,7 @@
           <w:szCs w:val="20"/>
           <w:rtl w:val="0"/>
         </w:rPr>
-        <w:t>Second, although recent work on digital internationalization has advanced important theoretical insights, much of it remains conceptual or focused on multinational samples, leaving under-examined the within-economy firm-level question of how foundational digital adoption interacts with export intensity in a single digitally mature institutional environment. In particular, the literature still lacks clear firm-level evidence on whether basic digital presence and transaction-enabling systems matter uniformly across firms or mainly when cross-border coordination demands intensify (Bharadwaj et al., 2013; Verhoef et al., 2021).</w:t>
+        <w:t>Second, although recent work on digital internationalization has advanced important theoretical insights (Banalieva &amp; Dhanaraj, 2019; Stallkamp &amp; Schotter, 2021), much of it remains conceptual or focused on multinational samples, leaving under-examined the within-economy firm-level question of how foundational digital adoption interacts with export intensity in a single digitally mature institutional environment. In particular, the literature still lacks clear firm-level evidence on whether basic digital presence and transaction-enabling systems matter uniformly across firms or mainly when cross-border coordination demands intensify (Bharadwaj et al., 2013; Verhoef et al., 2021).</w:t>
       </w:r>
       <w:r>
         <w:rPr>
@@ -1267,7 +1267,7 @@
           <w:szCs w:val="20"/>
           <w:rtl w:val="0"/>
         </w:rPr>
-        <w:t>The focal internationalization variable is FSTS, defined as the proportion of annual sales derived from direct exports and rescaled to the [0,1] interval. FSTS is mean-centered before squaring in order to mitigate multicollinearity between the linear and quadratic terms. In the final specifications, variance inflation factors remain below 3, indicating that multicollinearity is not a material concern.</w:t>
+        <w:t>The focal internationalization variable is FSTS, defined as the proportion of annual sales derived from direct exports and rescaled to the [0,1] interval. FSTS is mean-centered before squaring in order to mitigate multicollinearity between the linear and quadratic terms (Aiken &amp; West, 1991). In the final specifications, variance inflation factors remain below 3, indicating that multicollinearity is not a material concern (O’Brien, 2007).</w:t>
       </w:r>
       <w:r>
         <w:rPr>
@@ -1367,7 +1367,7 @@
           <w:szCs w:val="20"/>
           <w:rtl w:val="0"/>
         </w:rPr>
-        <w:t>The models include firm size, firm age, foreign ownership, and broad sector fixed effects as controls. Firm size is measured as the natural logarithm of the number of full-time employees, firm age is calculated from year of establishment, and foreign ownership is coded as an indicator for at least 10% foreign equity. Broad sector indicators distinguish manufacturing, retail, and other services and absorb sector-level heterogeneity in productivity, export propensity, and technology-adoption norms. Manager experience, initially considered as a control, was dropped after variance-inflation diagnostics indicated problematic collinearity with firm size.</w:t>
+        <w:t>The models include firm size, firm age, foreign ownership, and broad sector fixed effects as controls. Firm size is measured as the natural logarithm of the number of full-time employees, firm age is calculated from year of establishment, and foreign ownership is coded as an indicator for at least 10% foreign equity. Broad sector indicators distinguish manufacturing, retail, and other services and absorb sector-level heterogeneity in productivity, export propensity, and technology-adoption norms. Manager experience, originally motivated by the upper-echelons framework (Hambrick &amp; Mason, 1984) and initially considered as a control, was dropped after variance-inflation diagnostics indicated problematic collinearity with firm size.</w:t>
       </w:r>
       <w:r>
         <w:rPr>
@@ -1412,7 +1412,7 @@
           <w:szCs w:val="20"/>
           <w:rtl w:val="0"/>
         </w:rPr>
-        <w:t>The empirical analysis uses ordinary least squares with broad sector fixed effects and HC1 heteroskedasticity-robust standard errors throughout. Models are estimated sequentially, beginning with a controls-only specification and then moving to a linear internationalization model, a quadratic baseline, direct-effect models for TCI and DAI, and full specifications that incorporate moderation terms. The baseline quadratic specification evaluates whether the internationalization–performance relationship follows the conventional inverted-U logic, while the later specifications test whether TCI and DAI play distinct direct and contingent roles.</w:t>
+        <w:t>The empirical analysis uses ordinary least squares with broad sector fixed effects and HC1 heteroskedasticity-robust standard errors throughout (MacKinnon &amp; White, 1985). Models are estimated sequentially, beginning with a controls-only specification and then moving to a linear internationalization model, a quadratic baseline, direct-effect models for TCI and DAI, and full specifications that incorporate moderation terms. The baseline quadratic specification evaluates whether the internationalization–performance relationship follows the conventional inverted-U logic, while the later specifications test whether TCI and DAI play distinct direct and contingent roles.</w:t>
       </w:r>
       <w:r>
         <w:rPr>
@@ -1457,7 +1457,7 @@
           <w:szCs w:val="20"/>
           <w:rtl w:val="0"/>
         </w:rPr>
-        <w:t>The full model includes centered FSTS, squared centered FSTS, TCI, DAI, the interaction between FSTS and DAI, and the interaction between squared FSTS and DAI, in addition to the control set. A supplementary specification replaces the DAI interaction block with analogous TCI interaction terms in order to assess whether technological capability operates primarily as a moderator or as an intercept-shifting capability variable. To assess the quadratic shape formally, the study applies the Lind and Mehlum test for a U-shaped or inverted-U relationship. To assess whether the DAI interaction block matters jointly, the study reports a joint F-test on the two DAI interaction terms and also interprets effect size using Cohen’s f².</w:t>
+        <w:t>The full model includes centered FSTS, squared centered FSTS, TCI, DAI, the interaction between FSTS and DAI, and the interaction between squared FSTS and DAI, in addition to the control set. A supplementary specification replaces the DAI interaction block with analogous TCI interaction terms in order to assess whether technological capability operates primarily as a moderator or as an intercept-shifting capability variable. Following the recommendations of Haans et al. (2016) for testing curvilinear relationships in strategy research, the study applies the Lind and Mehlum (2010) test for a U-shaped or inverted-U relationship to assess the quadratic shape formally. To assess whether the DAI interaction block matters jointly, the study reports a joint F-test on the two DAI interaction terms and also interprets effect size using Cohen’s f² (Aguinis et al., 2005; Cohen, 1988).</w:t>
       </w:r>
       <w:r>
         <w:rPr>
@@ -1479,7 +1479,7 @@
           <w:szCs w:val="20"/>
           <w:rtl w:val="0"/>
         </w:rPr>
-        <w:t>The identification scope of the study is explicitly associational rather than causal. Because the design is cross-sectional, the analysis cannot rule out reverse causation or omitted-variable bias in the observed relationships among productivity, export intensity, technological capability, and digital adoption. For that reason, the manuscript should consistently use language such as “is associated with,” “is consistent with,” and “supports” rather than causal wording.</w:t>
+        <w:t>The identification scope of the study is explicitly associational rather than causal, in line with the disciplined causal-language conventions advocated for international business and strategy research (Antonakis et al., 2010; Meyer et al., 2017; Shaver, 2020). Because the design is cross-sectional, the analysis cannot rule out reverse causation or omitted-variable bias in the observed relationships among productivity, export intensity, technological capability, and digital adoption. For that reason, the manuscript should consistently use language such as “is associated with,” “is consistent with,” and “supports” rather than causal wording.</w:t>
       </w:r>
       <w:r>
         <w:rPr>
@@ -18008,7 +18008,7 @@
           <w:szCs w:val="20"/>
           <w:rtl w:val="0"/>
         </w:rPr>
-        <w:t>Three limitations warrant explicit caution in interpreting the findings. First, the analysis is cross-sectional, and the identification strategy is therefore associational rather than causal. The observed positive associations among TCI, DAI, internationalization, and labour productivity admit at least two non-causal interpretations consistent with the data. The first is productivity-driven self-selection into digital adoption: more productive firms may have the financial slack and managerial bandwidth to install electronic-payment systems and digital interfaces, so the observed DAI–productivity association may reflect this selection channel rather than a productivity-enhancing effect of digital adoption per se. The second is productivity-driven self-selection into international markets, in which only firms above a productivity threshold profitably overcome the fixed costs of exporting; the observed FSTS–DAI interaction could therefore reflect productivity-induced co-movement of export intensity and digital-system utilization rather than a digital-system-induced productivity gain. Standard ex post diagnostics, such as non-significant inverse Mills ratios from Heckman-style models, do not constitute affirmative evidence of unbiasedness in the absence of a valid exclusion restriction. The disciplined response is therefore to restrict interpretation to a boundary-condition claim—that the I–P curvature and the marginal value of digital adoption appear systematically conditional on export intensity in a digital-frontier setting—while leaving causal identification to designs that cannot be implemented in the present study.</w:t>
+        <w:t>Three limitations warrant explicit caution in interpreting the findings. First, the analysis is cross-sectional, and the identification strategy is therefore associational rather than causal. The observed positive associations among TCI, DAI, internationalization, and labour productivity admit at least two non-causal interpretations consistent with the data. The first is productivity-driven self-selection into digital adoption: more productive firms may have the financial slack and managerial bandwidth to install electronic-payment systems and digital interfaces, so the observed DAI–productivity association may reflect this selection channel rather than a productivity-enhancing effect of digital adoption per se. The second is productivity-driven self-selection into international markets, in which only firms above a productivity threshold profitably overcome the fixed costs of exporting; the observed FSTS–DAI interaction could therefore reflect productivity-induced co-movement of export intensity and digital-system utilization rather than a digital-system-induced productivity gain. Standard ex post diagnostics, such as non-significant inverse Mills ratios from Heckman-style models, do not constitute affirmative evidence of unbiasedness in the absence of a valid exclusion restriction (Wolfolds &amp; Siegel, 2019). The disciplined response is therefore to restrict interpretation to a boundary-condition claim—that the I–P curvature and the marginal value of digital adoption appear systematically conditional on export intensity in a digital-frontier setting—while leaving causal identification to designs that cannot be implemented in the present study.</w:t>
       </w:r>
       <w:r>
         <w:rPr>
@@ -18052,7 +18052,7 @@
           <w:szCs w:val="20"/>
           <w:rtl w:val="0"/>
         </w:rPr>
-        <w:t>Third, the estimated moderation effect is statistically detectable but substantively modest. The findings should therefore be treated as an initial firm-level test of a digital-frontier argument rather than as definitive evidence of a generalized boundary condition. The DAI indicators available in WBES 2023 capture Tier 1–2 digital adoption—digital presence and digital transaction usage—rather than Tier 3–4 digital capability or digital dynamic capability. Whether the scale-enabling-complement pattern persists, attenuates, or is amplified under richer measures of digitally integrated organizational capabilities remains an open empirical question. Future research should therefore examine whether the same pattern appears in other digitally mature economies, such as Hong Kong, the Republic of Korea, and Taiwan, and under purpose-designed instruments that capture deeper digital dynamic capabilities. Future research should also extend this measurement architecture by linking WBES-type microdata, where confidentiality arrangements permit, to firm-level databases or by using purpose-built survey instruments that better capture process-level digital integration and higher-order capability depth. More broadly, future work should examine whether the scale-enabling-complement pattern operates through identifiable mechanisms such as supplier-side digital integration, customer-facing digital channels, or internal ERP integration. Causal identification, in particular, would benefit from firm-level panel data, successive enterprise-survey waves, national statistical-office registers, or proprietary databases that permit firm fixed-effects estimation. Where suitable instruments are available, such as regional digital-infrastructure rollouts or plausibly exogenous trade-policy shocks, instrumental-variable or difference-in-differences designs would further upgrade the present associational evidence to causal identification. These designs would directly test whether the boundary condition documented here—namely, that digital adoption operates as a scale-enabling complement at high export intensity in digital-frontier settings—is causally generated rather than reflecting selection on unobserved firm-level performance heterogeneity.</w:t>
+        <w:t>Third, the estimated moderation effect is statistically detectable but substantively modest. The findings should therefore be treated as an initial firm-level test of a digital-frontier argument rather than as definitive evidence of a generalized boundary condition. The DAI indicators available in WBES 2023 capture Tier 1–2 digital adoption—digital presence and digital transaction usage—rather than Tier 3–4 digital capability or digital dynamic capability. Although equivalence-testing approaches (Lakens et al., 2018) could in principle quantify the support for null moderation in subsamples, the present sample size limits their power, and the more cautious reading is that absence of moderation cannot be inferred from non-significance alone. Whether the scale-enabling-complement pattern persists, attenuates, or is amplified under richer measures of digitally integrated organizational capabilities remains an open empirical question. Future research should therefore examine whether the same pattern appears in other digitally mature economies, such as Hong Kong, the Republic of Korea, and Taiwan, and under purpose-designed instruments that capture deeper digital dynamic capabilities. Future research should also extend this measurement architecture by linking WBES-type microdata, where confidentiality arrangements permit, to firm-level databases or by using purpose-built survey instruments that better capture process-level digital integration and higher-order capability depth. More broadly, future work should examine whether the scale-enabling-complement pattern operates through identifiable mechanisms such as supplier-side digital integration, customer-facing digital channels, or internal ERP integration. Causal identification, in particular, would benefit from firm-level panel data, successive enterprise-survey waves, national statistical-office registers, or proprietary databases that permit firm fixed-effects estimation. Where suitable instruments are available, such as regional digital-infrastructure rollouts or plausibly exogenous trade-policy shocks, instrumental-variable or difference-in-differences designs would further upgrade the present associational evidence to causal identification. These designs would directly test whether the boundary condition documented here—namely, that digital adoption operates as a scale-enabling complement at high export intensity in digital-frontier settings—is causally generated rather than reflecting selection on unobserved firm-level performance heterogeneity.</w:t>
       </w:r>
       <w:r>
         <w:rPr>

</xml_diff>